<commit_message>
arreglos interesantes de la branch dev
</commit_message>
<xml_diff>
--- a/public/templates/liquidacion-inquilino2.docx
+++ b/public/templates/liquidacion-inquilino2.docx
@@ -1,6 +1,6 @@
 
 <file path=word/document.xml><?xml version="1.0" encoding="utf-8"?>
-<w:document xmlns:wpc="http://schemas.microsoft.com/office/word/2010/wordprocessingCanvas" xmlns:cx="http://schemas.microsoft.com/office/drawing/2014/chartex" xmlns:mc="http://schemas.openxmlformats.org/markup-compatibility/2006" xmlns:o="urn:schemas-microsoft-com:office:office" xmlns:r="http://schemas.openxmlformats.org/officeDocument/2006/relationships" xmlns:m="http://schemas.openxmlformats.org/officeDocument/2006/math" xmlns:v="urn:schemas-microsoft-com:vml" xmlns:wp14="http://schemas.microsoft.com/office/word/2010/wordprocessingDrawing" xmlns:wp="http://schemas.openxmlformats.org/drawingml/2006/wordprocessingDrawing" xmlns:w10="urn:schemas-microsoft-com:office:word" xmlns:w="http://schemas.openxmlformats.org/wordprocessingml/2006/main" xmlns:w14="http://schemas.microsoft.com/office/word/2010/wordml" xmlns:w15="http://schemas.microsoft.com/office/word/2012/wordml" xmlns:w16se="http://schemas.microsoft.com/office/word/2015/wordml/symex" xmlns:wpg="http://schemas.microsoft.com/office/word/2010/wordprocessingGroup" xmlns:wpi="http://schemas.microsoft.com/office/word/2010/wordprocessingInk" xmlns:wne="http://schemas.microsoft.com/office/word/2006/wordml" xmlns:wps="http://schemas.microsoft.com/office/word/2010/wordprocessingShape" mc:Ignorable="w14 w15 w16se wp14">
+<w:document xmlns:wpc="http://schemas.microsoft.com/office/word/2010/wordprocessingCanvas" xmlns:cx="http://schemas.microsoft.com/office/drawing/2014/chartex" xmlns:cx1="http://schemas.microsoft.com/office/drawing/2015/9/8/chartex" xmlns:cx2="http://schemas.microsoft.com/office/drawing/2015/10/21/chartex" xmlns:cx3="http://schemas.microsoft.com/office/drawing/2016/5/9/chartex" xmlns:cx4="http://schemas.microsoft.com/office/drawing/2016/5/10/chartex" xmlns:cx5="http://schemas.microsoft.com/office/drawing/2016/5/11/chartex" xmlns:cx6="http://schemas.microsoft.com/office/drawing/2016/5/12/chartex" xmlns:cx7="http://schemas.microsoft.com/office/drawing/2016/5/13/chartex" xmlns:cx8="http://schemas.microsoft.com/office/drawing/2016/5/14/chartex" xmlns:mc="http://schemas.openxmlformats.org/markup-compatibility/2006" xmlns:aink="http://schemas.microsoft.com/office/drawing/2016/ink" xmlns:am3d="http://schemas.microsoft.com/office/drawing/2017/model3d" xmlns:o="urn:schemas-microsoft-com:office:office" xmlns:oel="http://schemas.microsoft.com/office/2019/extlst" xmlns:r="http://schemas.openxmlformats.org/officeDocument/2006/relationships" xmlns:m="http://schemas.openxmlformats.org/officeDocument/2006/math" xmlns:v="urn:schemas-microsoft-com:vml" xmlns:wp14="http://schemas.microsoft.com/office/word/2010/wordprocessingDrawing" xmlns:wp="http://schemas.openxmlformats.org/drawingml/2006/wordprocessingDrawing" xmlns:w10="urn:schemas-microsoft-com:office:word" xmlns:w="http://schemas.openxmlformats.org/wordprocessingml/2006/main" xmlns:w14="http://schemas.microsoft.com/office/word/2010/wordml" xmlns:w15="http://schemas.microsoft.com/office/word/2012/wordml" xmlns:w16cex="http://schemas.microsoft.com/office/word/2018/wordml/cex" xmlns:w16cid="http://schemas.microsoft.com/office/word/2016/wordml/cid" xmlns:w16="http://schemas.microsoft.com/office/word/2018/wordml" xmlns:w16du="http://schemas.microsoft.com/office/word/2023/wordml/word16du" xmlns:w16sdtdh="http://schemas.microsoft.com/office/word/2020/wordml/sdtdatahash" xmlns:w16sdtfl="http://schemas.microsoft.com/office/word/2024/wordml/sdtformatlock" xmlns:w16se="http://schemas.microsoft.com/office/word/2015/wordml/symex" xmlns:wpg="http://schemas.microsoft.com/office/word/2010/wordprocessingGroup" xmlns:wpi="http://schemas.microsoft.com/office/word/2010/wordprocessingInk" xmlns:wne="http://schemas.microsoft.com/office/word/2006/wordml" xmlns:wps="http://schemas.microsoft.com/office/word/2010/wordprocessingShape" mc:Ignorable="w14 w15 w16se w16cid w16 w16cex w16sdtdh w16sdtfl w16du wp14">
   <w:body>
     <w:tbl>
       <w:tblPr>
@@ -9,14 +9,13 @@
         <w:tblLook w:val="04A0" w:firstRow="1" w:lastRow="0" w:firstColumn="1" w:lastColumn="0" w:noHBand="0" w:noVBand="1"/>
       </w:tblPr>
       <w:tblGrid>
-        <w:gridCol w:w="4608"/>
-        <w:gridCol w:w="1530"/>
-        <w:gridCol w:w="2690"/>
+        <w:gridCol w:w="5665"/>
+        <w:gridCol w:w="3119"/>
       </w:tblGrid>
       <w:tr>
         <w:tc>
           <w:tcPr>
-            <w:tcW w:w="4765" w:type="dxa"/>
+            <w:tcW w:w="5665" w:type="dxa"/>
           </w:tcPr>
           <w:p>
             <w:pPr>
@@ -51,28 +50,7 @@
         </w:tc>
         <w:tc>
           <w:tcPr>
-            <w:tcW w:w="1607" w:type="dxa"/>
-          </w:tcPr>
-          <w:p>
-            <w:pPr>
-              <w:jc w:val="center"/>
-              <w:rPr>
-                <w:b/>
-                <w:lang w:val="es-AR"/>
-              </w:rPr>
-            </w:pPr>
-            <w:r>
-              <w:rPr>
-                <w:b/>
-                <w:lang w:val="es-AR"/>
-              </w:rPr>
-              <w:t>DEBE</w:t>
-            </w:r>
-          </w:p>
-        </w:tc>
-        <w:tc>
-          <w:tcPr>
-            <w:tcW w:w="2456" w:type="dxa"/>
+            <w:tcW w:w="3119" w:type="dxa"/>
           </w:tcPr>
           <w:p>
             <w:pPr>
@@ -95,7 +73,39 @@
       <w:tr>
         <w:tc>
           <w:tcPr>
-            <w:tcW w:w="4765" w:type="dxa"/>
+            <w:tcW w:w="5665" w:type="dxa"/>
+          </w:tcPr>
+          <w:p>
+            <w:pPr>
+              <w:rPr>
+                <w:lang w:val="es-AR"/>
+              </w:rPr>
+            </w:pPr>
+            <w:r>
+              <w:rPr>
+                <w:lang w:val="es-AR"/>
+              </w:rPr>
+              <w:t>Alquiler {</w:t>
+            </w:r>
+            <w:proofErr w:type="spellStart"/>
+            <w:r>
+              <w:rPr>
+                <w:lang w:val="es-AR"/>
+              </w:rPr>
+              <w:t>direccion</w:t>
+            </w:r>
+            <w:proofErr w:type="spellEnd"/>
+            <w:r>
+              <w:rPr>
+                <w:lang w:val="es-AR"/>
+              </w:rPr>
+              <w:t>} – {piso}</w:t>
+            </w:r>
+          </w:p>
+        </w:tc>
+        <w:tc>
+          <w:tcPr>
+            <w:tcW w:w="3119" w:type="dxa"/>
           </w:tcPr>
           <w:p>
             <w:pPr>
@@ -108,129 +118,24 @@
               <w:rPr>
                 <w:lang w:val="es-AR"/>
               </w:rPr>
-              <w:t>Alquiler correspondiente a {periodo}</w:t>
-            </w:r>
-          </w:p>
-        </w:tc>
-        <w:tc>
-          <w:tcPr>
-            <w:tcW w:w="1607" w:type="dxa"/>
-          </w:tcPr>
-          <w:p>
-            <w:pPr>
-              <w:rPr>
-                <w:lang w:val="es-AR"/>
-              </w:rPr>
-            </w:pPr>
-          </w:p>
-        </w:tc>
-        <w:tc>
-          <w:tcPr>
-            <w:tcW w:w="2456" w:type="dxa"/>
-          </w:tcPr>
-          <w:p>
-            <w:pPr>
-              <w:rPr>
-                <w:lang w:val="es-AR"/>
-              </w:rPr>
-            </w:pPr>
-          </w:p>
-        </w:tc>
-      </w:tr>
-      <w:tr>
-        <w:tc>
-          <w:tcPr>
-            <w:tcW w:w="4765" w:type="dxa"/>
-          </w:tcPr>
-          <w:p>
-            <w:pPr>
-              <w:rPr>
-                <w:lang w:val="es-AR"/>
-              </w:rPr>
-            </w:pPr>
-            <w:r>
-              <w:rPr>
-                <w:lang w:val="es-AR"/>
-              </w:rPr>
-              <w:t>Alquiler {</w:t>
+              <w:t>${</w:t>
             </w:r>
             <w:proofErr w:type="spellStart"/>
             <w:r>
               <w:rPr>
                 <w:lang w:val="es-AR"/>
               </w:rPr>
-              <w:t>direccio</w:t>
-            </w:r>
-            <w:r>
-              <w:rPr>
-                <w:lang w:val="es-AR"/>
-              </w:rPr>
-              <w:t>n</w:t>
+              <w:t>montoAlquiler</w:t>
             </w:r>
             <w:proofErr w:type="spellEnd"/>
-            <w:r>
-              <w:rPr>
-                <w:lang w:val="es-AR"/>
-              </w:rPr>
-              <w:t>} – {piso}</w:t>
-            </w:r>
-          </w:p>
-        </w:tc>
-        <w:tc>
-          <w:tcPr>
-            <w:tcW w:w="1607" w:type="dxa"/>
-          </w:tcPr>
-          <w:p>
-            <w:pPr>
-              <w:rPr>
-                <w:lang w:val="es-AR"/>
-              </w:rPr>
-            </w:pPr>
-          </w:p>
-        </w:tc>
-        <w:tc>
-          <w:tcPr>
-            <w:tcW w:w="2456" w:type="dxa"/>
-          </w:tcPr>
-          <w:p>
-            <w:pPr>
-              <w:jc w:val="center"/>
-              <w:rPr>
-                <w:lang w:val="es-AR"/>
-              </w:rPr>
-            </w:pPr>
-            <w:r>
-              <w:rPr>
-                <w:lang w:val="es-AR"/>
-              </w:rPr>
-              <w:t>$</w:t>
-            </w:r>
-            <w:r>
-              <w:rPr>
-                <w:lang w:val="es-AR"/>
-              </w:rPr>
-              <w:t>{</w:t>
-            </w:r>
-            <w:proofErr w:type="spellStart"/>
-            <w:r>
-              <w:rPr>
-                <w:lang w:val="es-AR"/>
-              </w:rPr>
-              <w:t>montoAlquiler</w:t>
-            </w:r>
-            <w:proofErr w:type="spellEnd"/>
-            <w:r>
-              <w:rPr>
-                <w:lang w:val="es-AR"/>
-              </w:rPr>
-              <w:t>}</w:t>
-            </w:r>
-            <w:r>
-              <w:rPr>
-                <w:lang w:val="es-AR"/>
-              </w:rPr>
-              <w:t>.-</w:t>
-            </w:r>
+            <w:proofErr w:type="gramStart"/>
+            <w:r>
+              <w:rPr>
+                <w:lang w:val="es-AR"/>
+              </w:rPr>
+              <w:t>}.-</w:t>
+            </w:r>
+            <w:proofErr w:type="gramEnd"/>
           </w:p>
         </w:tc>
       </w:tr>
@@ -240,7 +145,7 @@
         </w:trPr>
         <w:tc>
           <w:tcPr>
-            <w:tcW w:w="4765" w:type="dxa"/>
+            <w:tcW w:w="5665" w:type="dxa"/>
           </w:tcPr>
           <w:p>
             <w:pPr>
@@ -254,51 +159,25 @@
               </w:rPr>
               <w:t>{#</w:t>
             </w:r>
-            <w:proofErr w:type="spellStart"/>
-            <w:r>
-              <w:rPr>
-                <w:lang w:val="es-AR"/>
-              </w:rPr>
-              <w:t>itemsInquilino</w:t>
-            </w:r>
-            <w:proofErr w:type="spellEnd"/>
-            <w:r>
-              <w:rPr>
-                <w:lang w:val="es-AR"/>
-              </w:rPr>
-              <w:t>}{</w:t>
-            </w:r>
-            <w:proofErr w:type="spellStart"/>
-            <w:r>
-              <w:rPr>
-                <w:lang w:val="es-AR"/>
-              </w:rPr>
-              <w:t>descripcion</w:t>
-            </w:r>
-            <w:proofErr w:type="spellEnd"/>
-            <w:r>
-              <w:rPr>
-                <w:lang w:val="es-AR"/>
-              </w:rPr>
-              <w:t>}</w:t>
+            <w:proofErr w:type="gramStart"/>
+            <w:r>
+              <w:rPr>
+                <w:lang w:val="es-AR"/>
+              </w:rPr>
+              <w:t>itemsInquilino}{</w:t>
+            </w:r>
+            <w:proofErr w:type="gramEnd"/>
+            <w:r>
+              <w:rPr>
+                <w:lang w:val="es-AR"/>
+              </w:rPr>
+              <w:t>descripcion}</w:t>
             </w:r>
           </w:p>
         </w:tc>
         <w:tc>
           <w:tcPr>
-            <w:tcW w:w="1607" w:type="dxa"/>
-          </w:tcPr>
-          <w:p>
-            <w:pPr>
-              <w:rPr>
-                <w:lang w:val="es-AR"/>
-              </w:rPr>
-            </w:pPr>
-          </w:p>
-        </w:tc>
-        <w:tc>
-          <w:tcPr>
-            <w:tcW w:w="2456" w:type="dxa"/>
+            <w:tcW w:w="3119" w:type="dxa"/>
           </w:tcPr>
           <w:p>
             <w:pPr>
@@ -311,13 +190,7 @@
               <w:rPr>
                 <w:lang w:val="es-AR"/>
               </w:rPr>
-              <w:t>$</w:t>
-            </w:r>
-            <w:r>
-              <w:rPr>
-                <w:lang w:val="es-AR"/>
-              </w:rPr>
-              <w:t>{monto}{/</w:t>
+              <w:t>${monto}{/</w:t>
             </w:r>
             <w:proofErr w:type="spellStart"/>
             <w:r>
@@ -327,18 +200,14 @@
               <w:t>itemsInquilino</w:t>
             </w:r>
             <w:proofErr w:type="spellEnd"/>
-            <w:r>
-              <w:rPr>
-                <w:lang w:val="es-AR"/>
-              </w:rPr>
-              <w:t>}</w:t>
-            </w:r>
-            <w:r>
-              <w:rPr>
-                <w:lang w:val="es-AR"/>
-              </w:rPr>
-              <w:t>.-</w:t>
-            </w:r>
+            <w:proofErr w:type="gramStart"/>
+            <w:r>
+              <w:rPr>
+                <w:lang w:val="es-AR"/>
+              </w:rPr>
+              <w:t>}.-</w:t>
+            </w:r>
+            <w:proofErr w:type="gramEnd"/>
           </w:p>
         </w:tc>
       </w:tr>
@@ -352,7 +221,7 @@
     </w:p>
     <w:tbl>
       <w:tblPr>
-        <w:tblStyle w:val="Tabladecuadrcula4-nfasis3"/>
+        <w:tblStyle w:val="Tablaconcuadrcula4-nfasis3"/>
         <w:tblW w:w="0" w:type="auto"/>
         <w:tblLook w:val="04A0" w:firstRow="1" w:lastRow="0" w:firstColumn="1" w:lastColumn="0" w:noHBand="0" w:noVBand="1"/>
       </w:tblPr>
@@ -428,8 +297,6 @@
               </w:rPr>
               <w:t>.-</w:t>
             </w:r>
-            <w:bookmarkStart w:id="0" w:name="_GoBack"/>
-            <w:bookmarkEnd w:id="0"/>
           </w:p>
         </w:tc>
       </w:tr>
@@ -452,7 +319,7 @@
 </file>
 
 <file path=word/styles.xml><?xml version="1.0" encoding="utf-8"?>
-<w:styles xmlns:mc="http://schemas.openxmlformats.org/markup-compatibility/2006" xmlns:r="http://schemas.openxmlformats.org/officeDocument/2006/relationships" xmlns:w="http://schemas.openxmlformats.org/wordprocessingml/2006/main" xmlns:w14="http://schemas.microsoft.com/office/word/2010/wordml" xmlns:w15="http://schemas.microsoft.com/office/word/2012/wordml" xmlns:w16se="http://schemas.microsoft.com/office/word/2015/wordml/symex" mc:Ignorable="w14 w15 w16se">
+<w:styles xmlns:mc="http://schemas.openxmlformats.org/markup-compatibility/2006" xmlns:r="http://schemas.openxmlformats.org/officeDocument/2006/relationships" xmlns:w="http://schemas.openxmlformats.org/wordprocessingml/2006/main" xmlns:w14="http://schemas.microsoft.com/office/word/2010/wordml" xmlns:w15="http://schemas.microsoft.com/office/word/2012/wordml" xmlns:w16cex="http://schemas.microsoft.com/office/word/2018/wordml/cex" xmlns:w16cid="http://schemas.microsoft.com/office/word/2016/wordml/cid" xmlns:w16="http://schemas.microsoft.com/office/word/2018/wordml" xmlns:w16du="http://schemas.microsoft.com/office/word/2023/wordml/word16du" xmlns:w16sdtdh="http://schemas.microsoft.com/office/word/2020/wordml/sdtdatahash" xmlns:w16sdtfl="http://schemas.microsoft.com/office/word/2024/wordml/sdtformatlock" xmlns:w16se="http://schemas.microsoft.com/office/word/2015/wordml/symex" mc:Ignorable="w14 w15 w16se w16cid w16 w16cex w16sdtdh w16sdtfl w16du">
   <w:docDefaults>
     <w:rPrDefault>
       <w:rPr>
@@ -468,7 +335,7 @@
       </w:pPr>
     </w:pPrDefault>
   </w:docDefaults>
-  <w:latentStyles w:defLockedState="0" w:defUIPriority="99" w:defSemiHidden="0" w:defUnhideWhenUsed="0" w:defQFormat="0" w:count="371">
+  <w:latentStyles w:defLockedState="0" w:defUIPriority="99" w:defSemiHidden="0" w:defUnhideWhenUsed="0" w:defQFormat="0" w:count="376">
     <w:lsdException w:name="Normal" w:uiPriority="0" w:qFormat="1"/>
     <w:lsdException w:name="heading 1" w:uiPriority="9" w:qFormat="1"/>
     <w:lsdException w:name="heading 2" w:semiHidden="1" w:uiPriority="9" w:unhideWhenUsed="1" w:qFormat="1"/>
@@ -840,6 +707,11 @@
     <w:lsdException w:name="List Table 5 Dark Accent 6" w:uiPriority="50"/>
     <w:lsdException w:name="List Table 6 Colorful Accent 6" w:uiPriority="51"/>
     <w:lsdException w:name="List Table 7 Colorful Accent 6" w:uiPriority="52"/>
+    <w:lsdException w:name="Mention" w:semiHidden="1" w:unhideWhenUsed="1"/>
+    <w:lsdException w:name="Smart Hyperlink" w:semiHidden="1" w:unhideWhenUsed="1"/>
+    <w:lsdException w:name="Hashtag" w:semiHidden="1" w:unhideWhenUsed="1"/>
+    <w:lsdException w:name="Unresolved Mention" w:semiHidden="1" w:unhideWhenUsed="1"/>
+    <w:lsdException w:name="Smart Link" w:semiHidden="1" w:unhideWhenUsed="1"/>
   </w:latentStyles>
   <w:style w:type="paragraph" w:default="1" w:styleId="Normal">
     <w:name w:val="Normal"/>
@@ -1015,7 +887,7 @@
       </w:tcPr>
     </w:tblStylePr>
   </w:style>
-  <w:style w:type="table" w:styleId="Tabladecuadrcula6concolores-nfasis3">
+  <w:style w:type="table" w:styleId="Tablaconcuadrcula6concolores-nfasis3">
     <w:name w:val="Grid Table 6 Colorful Accent 3"/>
     <w:basedOn w:val="Tablanormal"/>
     <w:uiPriority w:val="51"/>
@@ -1087,7 +959,7 @@
       </w:tcPr>
     </w:tblStylePr>
   </w:style>
-  <w:style w:type="table" w:styleId="Tabladecuadrcula4-nfasis3">
+  <w:style w:type="table" w:styleId="Tablaconcuadrcula4-nfasis3">
     <w:name w:val="Grid Table 4 Accent 3"/>
     <w:basedOn w:val="Tablanormal"/>
     <w:uiPriority w:val="49"/>

</xml_diff>

<commit_message>
se agregó informacion del inmueble en el sidebar info y se arreglaron algunos detalles en el contrato-c component
</commit_message>
<xml_diff>
--- a/public/templates/liquidacion-inquilino2.docx
+++ b/public/templates/liquidacion-inquilino2.docx
@@ -65,7 +65,7 @@
                 <w:b/>
                 <w:lang w:val="es-AR"/>
               </w:rPr>
-              <w:t>HABER</w:t>
+              <w:t>MONTO</w:t>
             </w:r>
           </w:p>
         </w:tc>
@@ -85,21 +85,31 @@
               <w:rPr>
                 <w:lang w:val="es-AR"/>
               </w:rPr>
-              <w:t>Alquiler {</w:t>
-            </w:r>
-            <w:proofErr w:type="spellStart"/>
-            <w:r>
-              <w:rPr>
-                <w:lang w:val="es-AR"/>
-              </w:rPr>
-              <w:t>direccion</w:t>
-            </w:r>
-            <w:proofErr w:type="spellEnd"/>
-            <w:r>
-              <w:rPr>
-                <w:lang w:val="es-AR"/>
-              </w:rPr>
-              <w:t>} – {piso}</w:t>
+              <w:t xml:space="preserve">Alquiler {direccion} – </w:t>
+            </w:r>
+            <w:r>
+              <w:rPr>
+                <w:lang w:val="es-AR"/>
+              </w:rPr>
+              <w:t xml:space="preserve">piso </w:t>
+            </w:r>
+            <w:r>
+              <w:rPr>
+                <w:lang w:val="es-AR"/>
+              </w:rPr>
+              <w:t>{piso}</w:t>
+            </w:r>
+            <w:r>
+              <w:rPr>
+                <w:lang w:val="es-AR"/>
+              </w:rPr>
+              <w:t>, letra</w:t>
+            </w:r>
+            <w:r>
+              <w:rPr>
+                <w:lang w:val="es-AR"/>
+              </w:rPr>
+              <w:t xml:space="preserve"> {letra}</w:t>
             </w:r>
           </w:p>
         </w:tc>
@@ -118,24 +128,8 @@
               <w:rPr>
                 <w:lang w:val="es-AR"/>
               </w:rPr>
-              <w:t>${</w:t>
-            </w:r>
-            <w:proofErr w:type="spellStart"/>
-            <w:r>
-              <w:rPr>
-                <w:lang w:val="es-AR"/>
-              </w:rPr>
-              <w:t>montoAlquiler</w:t>
-            </w:r>
-            <w:proofErr w:type="spellEnd"/>
-            <w:proofErr w:type="gramStart"/>
-            <w:r>
-              <w:rPr>
-                <w:lang w:val="es-AR"/>
-              </w:rPr>
-              <w:t>}.-</w:t>
-            </w:r>
-            <w:proofErr w:type="gramEnd"/>
+              <w:t>${montoAlquiler}.-</w:t>
+            </w:r>
           </w:p>
         </w:tc>
       </w:tr>
@@ -157,21 +151,7 @@
               <w:rPr>
                 <w:lang w:val="es-AR"/>
               </w:rPr>
-              <w:t>{#</w:t>
-            </w:r>
-            <w:proofErr w:type="gramStart"/>
-            <w:r>
-              <w:rPr>
-                <w:lang w:val="es-AR"/>
-              </w:rPr>
-              <w:t>itemsInquilino}{</w:t>
-            </w:r>
-            <w:proofErr w:type="gramEnd"/>
-            <w:r>
-              <w:rPr>
-                <w:lang w:val="es-AR"/>
-              </w:rPr>
-              <w:t>descripcion}</w:t>
+              <w:t>{#itemsInquilino}{descripcion}</w:t>
             </w:r>
           </w:p>
         </w:tc>
@@ -190,24 +170,8 @@
               <w:rPr>
                 <w:lang w:val="es-AR"/>
               </w:rPr>
-              <w:t>${monto}{/</w:t>
-            </w:r>
-            <w:proofErr w:type="spellStart"/>
-            <w:r>
-              <w:rPr>
-                <w:lang w:val="es-AR"/>
-              </w:rPr>
-              <w:t>itemsInquilino</w:t>
-            </w:r>
-            <w:proofErr w:type="spellEnd"/>
-            <w:proofErr w:type="gramStart"/>
-            <w:r>
-              <w:rPr>
-                <w:lang w:val="es-AR"/>
-              </w:rPr>
-              <w:t>}.-</w:t>
-            </w:r>
-            <w:proofErr w:type="gramEnd"/>
+              <w:t>${monto}{/itemsInquilino}.-</w:t>
+            </w:r>
           </w:p>
         </w:tc>
       </w:tr>

</xml_diff>